<commit_message>
Reporte Word fauna: sección "Requerimientos Ambientales Asociados a los Hallazgos"
Las medidas recomendadas (PPC, PAS 146, PAS 119 y Rescate y Relocalización de
Fauna Íctica) se marcan con un clic en el formulario y se agregan al final del
reporte con su texto completo. Si no se marca ninguna, la sección no aparece.

Co-Authored-By: Claude Opus 5.5 <noreply@anthropic.com>
</commit_message>
<xml_diff>
--- a/public/plantillas/reporte-fauna.docx
+++ b/public/plantillas/reporte-fauna.docx
@@ -2823,6 +2823,62 @@
         <w:t xml:space="preserve">{/comparacion}</w:t>
       </w:r>
     </w:p>
+    <w:p>
+      <w:r>
+        <w:t xml:space="preserve">{#hayMedidas}</w:t>
+      </w:r>
+    </w:p>
+    <w:p>
+      <w:r>
+        <w:br w:type="page"/>
+      </w:r>
+    </w:p>
+    <w:p>
+      <w:pPr>
+        <w:pStyle w:val="Heading1"/>
+      </w:pPr>
+      <w:r>
+        <w:t xml:space="preserve">{secReq}. Requerimientos Ambientales Asociados a los Hallazgos</w:t>
+      </w:r>
+    </w:p>
+    <w:p>
+      <w:r>
+        <w:t xml:space="preserve">{#medidas}</w:t>
+      </w:r>
+    </w:p>
+    <w:p>
+      <w:r>
+        <w:rPr>
+          <w:b/>
+        </w:rPr>
+        <w:t xml:space="preserve">{titulo}</w:t>
+      </w:r>
+    </w:p>
+    <w:p>
+      <w:r>
+        <w:t xml:space="preserve">{#parrafos}</w:t>
+      </w:r>
+    </w:p>
+    <w:p>
+      <w:r>
+        <w:t xml:space="preserve">{.}</w:t>
+      </w:r>
+    </w:p>
+    <w:p>
+      <w:r>
+        <w:t xml:space="preserve">{/parrafos}</w:t>
+      </w:r>
+    </w:p>
+    <w:p>
+      <w:r>
+        <w:t xml:space="preserve">{/medidas}</w:t>
+      </w:r>
+    </w:p>
+    <w:p>
+      <w:r>
+        <w:t xml:space="preserve">{/hayMedidas}</w:t>
+      </w:r>
+    </w:p>
     <w:sectPr>
       <w:footerReference w:type="default" r:id="rId9"/>
       <w:pgSz w:w="12240" w:h="15840"/>

</xml_diff>

<commit_message>
Reporte Word: portada sin tabla de versiones y "Fuente" sin año
Co-Authored-By: Claude Opus 5.5 <noreply@anthropic.com>
</commit_message>
<xml_diff>
--- a/public/plantillas/reporte-fauna.docx
+++ b/public/plantillas/reporte-fauna.docx
@@ -162,329 +162,6 @@
         </w:rPr>
       </w:pPr>
     </w:p>
-    <w:tbl>
-      <w:tblPr>
-        <w:tblW w:w="5000" w:type="pct"/>
-        <w:tblCellMar>
-          <w:left w:w="70" w:type="dxa"/>
-          <w:right w:w="70" w:type="dxa"/>
-        </w:tblCellMar>
-        <w:tblLook w:val="04A0" w:firstRow="1" w:lastRow="0" w:firstColumn="1" w:lastColumn="0" w:noHBand="0" w:noVBand="1"/>
-      </w:tblPr>
-      <w:tblGrid>
-        <w:gridCol w:w="1525"/>
-        <w:gridCol w:w="2465"/>
-        <w:gridCol w:w="2306"/>
-        <w:gridCol w:w="2532"/>
-      </w:tblGrid>
-      <w:tr>
-        <w:trPr>
-          <w:trHeight w:val="290"/>
-        </w:trPr>
-        <w:tc>
-          <w:tcPr>
-            <w:tcW w:w="864" w:type="pct"/>
-            <w:tcBorders>
-              <w:top w:val="single" w:sz="4" w:space="0" w:color="auto"/>
-              <w:left w:val="single" w:sz="4" w:space="0" w:color="auto"/>
-              <w:bottom w:val="single" w:sz="4" w:space="0" w:color="auto"/>
-              <w:right w:val="single" w:sz="4" w:space="0" w:color="auto"/>
-            </w:tcBorders>
-            <w:noWrap/>
-            <w:vAlign w:val="center"/>
-            <w:hideMark/>
-          </w:tcPr>
-          <w:p>
-            <w:pPr>
-              <w:pStyle w:val="CuerpoTabla"/>
-              <w:rPr>
-                <w:b/>
-                <w:bCs/>
-                <w:lang w:val="es-CL"/>
-              </w:rPr>
-            </w:pPr>
-            <w:r>
-              <w:rPr>
-                <w:b/>
-                <w:bCs/>
-                <w:lang w:val="es-CL"/>
-              </w:rPr>
-              <w:t>Versión</w:t>
-            </w:r>
-          </w:p>
-        </w:tc>
-        <w:tc>
-          <w:tcPr>
-            <w:tcW w:w="1396" w:type="pct"/>
-            <w:tcBorders>
-              <w:top w:val="single" w:sz="4" w:space="0" w:color="auto"/>
-              <w:left w:val="nil"/>
-              <w:bottom w:val="single" w:sz="4" w:space="0" w:color="auto"/>
-              <w:right w:val="single" w:sz="4" w:space="0" w:color="auto"/>
-            </w:tcBorders>
-            <w:noWrap/>
-            <w:vAlign w:val="center"/>
-            <w:hideMark/>
-          </w:tcPr>
-          <w:p>
-            <w:pPr>
-              <w:pStyle w:val="CuerpoTabla"/>
-              <w:rPr>
-                <w:b/>
-                <w:bCs/>
-                <w:lang w:val="es-CL"/>
-              </w:rPr>
-            </w:pPr>
-            <w:r>
-              <w:rPr>
-                <w:b/>
-                <w:bCs/>
-                <w:lang w:val="es-CL"/>
-              </w:rPr>
-              <w:t>Elaboración</w:t>
-            </w:r>
-          </w:p>
-        </w:tc>
-        <w:tc>
-          <w:tcPr>
-            <w:tcW w:w="1306" w:type="pct"/>
-            <w:tcBorders>
-              <w:top w:val="single" w:sz="4" w:space="0" w:color="auto"/>
-              <w:left w:val="nil"/>
-              <w:bottom w:val="single" w:sz="4" w:space="0" w:color="auto"/>
-              <w:right w:val="single" w:sz="4" w:space="0" w:color="auto"/>
-            </w:tcBorders>
-            <w:noWrap/>
-            <w:vAlign w:val="center"/>
-            <w:hideMark/>
-          </w:tcPr>
-          <w:p>
-            <w:pPr>
-              <w:pStyle w:val="CuerpoTabla"/>
-              <w:rPr>
-                <w:b/>
-                <w:bCs/>
-                <w:lang w:val="es-CL"/>
-              </w:rPr>
-            </w:pPr>
-            <w:r>
-              <w:rPr>
-                <w:b/>
-                <w:bCs/>
-                <w:lang w:val="es-CL"/>
-              </w:rPr>
-              <w:t>Revisión</w:t>
-            </w:r>
-          </w:p>
-        </w:tc>
-        <w:tc>
-          <w:tcPr>
-            <w:tcW w:w="1434" w:type="pct"/>
-            <w:tcBorders>
-              <w:top w:val="single" w:sz="4" w:space="0" w:color="auto"/>
-              <w:left w:val="nil"/>
-              <w:bottom w:val="single" w:sz="4" w:space="0" w:color="auto"/>
-              <w:right w:val="single" w:sz="4" w:space="0" w:color="auto"/>
-            </w:tcBorders>
-            <w:noWrap/>
-            <w:vAlign w:val="center"/>
-            <w:hideMark/>
-          </w:tcPr>
-          <w:p>
-            <w:pPr>
-              <w:pStyle w:val="CuerpoTabla"/>
-              <w:rPr>
-                <w:b/>
-                <w:bCs/>
-                <w:lang w:val="es-CL"/>
-              </w:rPr>
-            </w:pPr>
-            <w:r>
-              <w:rPr>
-                <w:b/>
-                <w:bCs/>
-                <w:lang w:val="es-CL"/>
-              </w:rPr>
-              <w:t>Aprobación</w:t>
-            </w:r>
-          </w:p>
-        </w:tc>
-      </w:tr>
-      <w:tr>
-        <w:trPr>
-          <w:trHeight w:val="290"/>
-        </w:trPr>
-        <w:tc>
-          <w:tcPr>
-            <w:tcW w:w="864" w:type="pct"/>
-            <w:tcBorders>
-              <w:top w:val="nil"/>
-              <w:left w:val="single" w:sz="4" w:space="0" w:color="auto"/>
-              <w:bottom w:val="single" w:sz="4" w:space="0" w:color="auto"/>
-              <w:right w:val="single" w:sz="4" w:space="0" w:color="auto"/>
-            </w:tcBorders>
-            <w:noWrap/>
-            <w:vAlign w:val="center"/>
-            <w:hideMark/>
-          </w:tcPr>
-          <w:p>
-            <w:pPr>
-              <w:pStyle w:val="CuerpoTabla"/>
-              <w:jc w:val="left"/>
-              <w:rPr>
-                <w:lang w:val="es-CL"/>
-              </w:rPr>
-            </w:pPr>
-            <w:r>
-              <w:rPr>
-                <w:lang w:val="es-CL"/>
-              </w:rPr>
-              <w:t>[Completar: N° versión]</w:t>
-            </w:r>
-          </w:p>
-          <w:p>
-            <w:pPr>
-              <w:pStyle w:val="CuerpoTabla"/>
-              <w:rPr>
-                <w:lang w:val="es-CL"/>
-              </w:rPr>
-            </w:pPr>
-          </w:p>
-        </w:tc>
-        <w:tc>
-          <w:tcPr>
-            <w:tcW w:w="1396" w:type="pct"/>
-            <w:tcBorders>
-              <w:top w:val="nil"/>
-              <w:left w:val="nil"/>
-              <w:bottom w:val="single" w:sz="4" w:space="0" w:color="auto"/>
-              <w:right w:val="single" w:sz="4" w:space="0" w:color="auto"/>
-            </w:tcBorders>
-            <w:noWrap/>
-            <w:vAlign w:val="center"/>
-            <w:hideMark/>
-          </w:tcPr>
-          <w:p>
-            <w:pPr>
-              <w:pStyle w:val="CuerpoTabla"/>
-              <w:jc w:val="left"/>
-              <w:rPr>
-                <w:lang w:val="es-CL"/>
-              </w:rPr>
-            </w:pPr>
-            <w:r>
-              <w:rPr>
-                <w:lang w:val="es-CL"/>
-              </w:rPr>
-              <w:t>[Completar: profesional que elabora]</w:t>
-            </w:r>
-          </w:p>
-          <w:p>
-            <w:pPr>
-              <w:pStyle w:val="CuerpoTabla"/>
-              <w:jc w:val="left"/>
-              <w:rPr>
-                <w:lang w:val="es-CL"/>
-              </w:rPr>
-            </w:pPr>
-            <w:r>
-              <w:rPr>
-                <w:lang w:val="es-CL"/>
-              </w:rPr>
-              <w:t>[Completar: fecha]</w:t>
-            </w:r>
-          </w:p>
-        </w:tc>
-        <w:tc>
-          <w:tcPr>
-            <w:tcW w:w="1306" w:type="pct"/>
-            <w:tcBorders>
-              <w:top w:val="nil"/>
-              <w:left w:val="nil"/>
-              <w:bottom w:val="single" w:sz="4" w:space="0" w:color="auto"/>
-              <w:right w:val="single" w:sz="4" w:space="0" w:color="auto"/>
-            </w:tcBorders>
-            <w:noWrap/>
-            <w:vAlign w:val="center"/>
-            <w:hideMark/>
-          </w:tcPr>
-          <w:p>
-            <w:pPr>
-              <w:pStyle w:val="CuerpoTabla"/>
-              <w:jc w:val="left"/>
-              <w:rPr>
-                <w:lang w:val="es-CL"/>
-              </w:rPr>
-            </w:pPr>
-            <w:r>
-              <w:rPr>
-                <w:lang w:val="es-CL"/>
-              </w:rPr>
-              <w:t>[Completar: profesional que revisa]</w:t>
-            </w:r>
-          </w:p>
-          <w:p>
-            <w:pPr>
-              <w:pStyle w:val="CuerpoTabla"/>
-              <w:jc w:val="left"/>
-              <w:rPr>
-                <w:lang w:val="es-CL"/>
-              </w:rPr>
-            </w:pPr>
-            <w:r>
-              <w:rPr>
-                <w:lang w:val="es-CL"/>
-              </w:rPr>
-              <w:t>[Completar: fecha]</w:t>
-            </w:r>
-          </w:p>
-        </w:tc>
-        <w:tc>
-          <w:tcPr>
-            <w:tcW w:w="1434" w:type="pct"/>
-            <w:tcBorders>
-              <w:top w:val="nil"/>
-              <w:left w:val="nil"/>
-              <w:bottom w:val="single" w:sz="4" w:space="0" w:color="auto"/>
-              <w:right w:val="single" w:sz="4" w:space="0" w:color="auto"/>
-            </w:tcBorders>
-            <w:noWrap/>
-            <w:vAlign w:val="center"/>
-            <w:hideMark/>
-          </w:tcPr>
-          <w:p>
-            <w:pPr>
-              <w:pStyle w:val="CuerpoTabla"/>
-              <w:jc w:val="left"/>
-              <w:rPr>
-                <w:lang w:val="es-CL"/>
-              </w:rPr>
-            </w:pPr>
-            <w:r>
-              <w:rPr>
-                <w:lang w:val="es-CL"/>
-              </w:rPr>
-              <w:t>[Completar: profesional que aprueba]</w:t>
-            </w:r>
-          </w:p>
-          <w:p>
-            <w:pPr>
-              <w:pStyle w:val="CuerpoTabla"/>
-              <w:jc w:val="left"/>
-              <w:rPr>
-                <w:lang w:val="es-CL"/>
-              </w:rPr>
-            </w:pPr>
-            <w:r>
-              <w:rPr>
-                <w:lang w:val="es-CL"/>
-              </w:rPr>
-              <w:t>[Completar: fecha]</w:t>
-            </w:r>
-          </w:p>
-        </w:tc>
-      </w:tr>
-    </w:tbl>
     <w:p>
       <w:r>
         <w:br w:type="page"/>
@@ -634,7 +311,7 @@
         <w:pStyle w:val="Fuente"/>
       </w:pPr>
       <w:r>
-        <w:t xml:space="preserve">Fuente: Elaboración propia, {anioReporte}.</w:t>
+        <w:t xml:space="preserve">Fuente: Elaboración propia.</w:t>
       </w:r>
     </w:p>
     <w:p>
@@ -743,7 +420,7 @@
         <w:pStyle w:val="Fuente"/>
       </w:pPr>
       <w:r>
-        <w:t xml:space="preserve">Fuente: Elaboración propia, {anioReporte}.</w:t>
+        <w:t xml:space="preserve">Fuente: Elaboración propia.</w:t>
       </w:r>
     </w:p>
     <w:p>
@@ -991,7 +668,7 @@
         <w:pStyle w:val="Fuente"/>
       </w:pPr>
       <w:r>
-        <w:t xml:space="preserve">Fuente: Elaboración propia, {anioReporte}.</w:t>
+        <w:t xml:space="preserve">Fuente: Elaboración propia.</w:t>
       </w:r>
     </w:p>
     <w:p>
@@ -1304,7 +981,7 @@
         <w:pStyle w:val="Fuente"/>
       </w:pPr>
       <w:r>
-        <w:t xml:space="preserve">Fuente: Elaboración propia, {anioReporte}.</w:t>
+        <w:t xml:space="preserve">Fuente: Elaboración propia.</w:t>
       </w:r>
     </w:p>
     <w:p>
@@ -1558,7 +1235,7 @@
         <w:pStyle w:val="Fuente"/>
       </w:pPr>
       <w:r>
-        <w:t xml:space="preserve">Fuente: Elaboración propia, {anioReporte}.</w:t>
+        <w:t xml:space="preserve">Fuente: Elaboración propia.</w:t>
       </w:r>
     </w:p>
     <w:p>
@@ -1646,7 +1323,7 @@
         <w:pStyle w:val="Fuente"/>
       </w:pPr>
       <w:r>
-        <w:t xml:space="preserve">Fuente: Elaboración propia, {anioReporte}.</w:t>
+        <w:t xml:space="preserve">Fuente: Elaboración propia.</w:t>
       </w:r>
     </w:p>
     <w:p>
@@ -2016,7 +1693,7 @@
         <w:pStyle w:val="Fuente"/>
       </w:pPr>
       <w:r>
-        <w:t xml:space="preserve">Fuente: Elaboración propia, {anioReporte}.</w:t>
+        <w:t xml:space="preserve">Fuente: Elaboración propia.</w:t>
       </w:r>
     </w:p>
     <w:p>

</xml_diff>